<commit_message>
Refine terminology from Rover to Autonomous Payload across Word, PDF deliverables and README
</commit_message>
<xml_diff>
--- a/Finals_Track3_Deliverables/1_Community_Building_Guide.docx
+++ b/Finals_Track3_Deliverables/1_Community_Building_Guide.docx
@@ -72,7 +72,7 @@
                 <w:color w:val="1E293B"/>
                 <w:sz w:val="18"/>
               </w:rPr>
-              <w:t>L-MINER Mk-II (Autonomous Lunar Mineral Detection Rover)</w:t>
+              <w:t>L-MINER Mk-II: Autonomous Lunar Mineral Prospecting Payload</w:t>
             </w:r>
           </w:p>
         </w:tc>
@@ -677,7 +677,7 @@
                 <w:color w:val="1E293B"/>
                 <w:sz w:val="16"/>
               </w:rPr>
-              <w:t>• 45s screen capture reel of 3D Rover HUD.</w:t>
+              <w:t>• 45s screen capture reel of 3D Payload HUD &amp; Mobile Simulation.</w:t>
               <w:br/>
               <w:t>• Community poll on lunar resources.</w:t>
               <w:br/>
@@ -1307,9 +1307,9 @@
               <w:t>As humanity prepares to establish sustainable bases on the Moon through Artemis and international lunar research programs, one question remains paramount: How do we locate volatile water ice trapped inside permanently shadowed craters at 40 Kelvin?</w:t>
               <w:br/>
               <w:br/>
-              <w:t>Introducing L-MINER Mk-II: An Autonomous Multi-Tier Rover for Subsurface Lunar Mineral Classification.</w:t>
+              <w:t>Introducing L-MINER Mk-II: An Autonomous Multi-Tier Mineral Prospecting Payload System for Lunar Surface Exploration.</w:t>
               <w:br/>
-              <w:t>Equipped with 500 MHz Ground Penetrating Radar, 0.5–2.5 μm VNIR-SWIR Reflectance Spectroscopy, and edge Random Forest ML, L-MINER autonomously navigates hazards, monitors power, and maps resources without Earth teleoperation lag.</w:t>
+              <w:t>Equipped with 500 MHz Ground Penetrating Radar, 0.5–2.5 μm VNIR-SWIR Reflectance Spectroscopy, and edge Random Forest ML, L-MINER's autonomous payload firmware navigates hazards, monitors power, and maps resources without Earth teleoperation lag.</w:t>
               <w:br/>
               <w:br/>
               <w:t>Proud to represent the Institute of Space Technology alongside teammates Haider Taqvee, Abdul Wasay, Saad, and Hajra.</w:t>
@@ -1384,7 +1384,7 @@
                 <w:color w:val="1E293B"/>
                 <w:sz w:val="19"/>
               </w:rPr>
-              <w:t>🧵 1/5 How does a rover 'see' water ice buried 2 meters under lunar dust? Here's how our project for #ISSSP2026 Track 3 works! 👇</w:t>
+              <w:t>🧵 1/5 How does an autonomous science payload 'see' water ice buried 2 meters under lunar dust? Here's how our project for #ISSSP2026 Track 3 works! 👇</w:t>
               <w:br/>
               <w:br/>
               <w:t>2/5 Optical cameras only see the top 10 microns of dust. That's why L-MINER Mk-II combines TWO complementary sensors: an underbelly 500 MHz GPR (for depth) + a robotic-arm VNIR-SWIR Spectrometer (for chemistry). 📡🔬</w:t>
@@ -1467,7 +1467,7 @@
               <w:t>IST Student Team Qualifies for Finals in International Space Competition (ISSSP 2026 Track 3)</w:t>
               <w:br/>
               <w:br/>
-              <w:t>ISLAMABAD — A multidisciplinary team of undergraduate engineers from the Institute of Space Technology (IST) has qualified for the finals of ISSSP 2026 Track 3 with their autonomous lunar rover project, L-MINER Mk-II.</w:t>
+              <w:t>ISLAMABAD — A multidisciplinary team of undergraduate engineers from the Institute of Space Technology (IST) has qualified for the finals of ISSSP 2026 Track 3 with their autonomous lunar prospecting payload project, L-MINER Mk-II.</w:t>
               <w:br/>
               <w:br/>
               <w:t>The project addresses the critical challenge of autonomous In-Situ Resource Utilization (ISRU) prospecting in the lunar South Pole. By fusing multi-frequency Ground Penetrating Radar with Short-Wave Infrared Spectroscopy and a three-tier hierarchical autonomy architecture, the system enables safe, unassisted prospecting inside Permanently Shadowed Regions (PSRs).</w:t>

</xml_diff>